<commit_message>
Books: add the «أقومية القرآن» material to the five books and two guides
Book One: attribution in 1.3 and 2.5; worked examples for the concept
ladder (manliness, table 5.8) and the eight-step protocol (Hud 9-11,
table 6.2); al-Jathiya in 9.4. Book Two: 6.18, 8.16, 9.2. Book Three:
4.5, 12.2. Book Four: 8.3, 12.1 and a chapter 12 guide exercise.
التأسيس المعرفي: chapter 2. Guides One and Two: new exercises.
Verse indexes updated in Books One to Four.

Co-Authored-By: Claude Opus 5.5 <noreply@anthropic.com>
Claude-Session: https://claude.ai/code/session_01LhGpaEd3xGUonrLS6HmYox
</commit_message>
<xml_diff>
--- a/book/الدليل_العملي_المرافق_للكتاب_الأول.docx
+++ b/book/الدليل_العملي_المرافق_للكتاب_الأول.docx
@@ -32488,6 +32488,212 @@
           <w:rtl/>
         </w:rPr>
         <w:t xml:space="preserve">ملاحظة منهجية: هذه المؤشرات للتقييم المرحلي، لا للحكم النهائي. العبرة باتجاهها: هل تتحسن؟ أما الرقم المطلق فلا يقول الكثير.</w:t>
+      </w:r>
+    </w:p>
+    <w:p>
+      <w:pPr>
+        <w:pageBreakBefore/>
+        <w:shd w:val="clear" w:color="auto" w:fill="156082"/>
+        <w:bidi/>
+        <w:spacing w:before="130" w:after="80"/>
+        <w:rPr>
+          <w:rFonts w:ascii="Sakkal Majalla" w:hAnsi="Sakkal Majalla" w:cs="Sakkal Majalla"/>
+          <w:sz w:val="26"/>
+          <w:szCs w:val="26"/>
+        </w:rPr>
+      </w:pPr>
+      <w:r>
+        <w:rPr>
+          <w:rFonts w:ascii="Sakkal Majalla" w:hAnsi="Sakkal Majalla" w:cs="Sakkal Majalla"/>
+          <w:b/>
+          <w:bCs/>
+          <w:color w:val="FFFFFF"/>
+          <w:sz w:val="26"/>
+          <w:szCs w:val="26"/>
+          <w:rtl/>
+        </w:rPr>
+        <w:t xml:space="preserve">7. تمارين تدبّر تطبيقية من منتدى «أقومية القرآن»</w:t>
+      </w:r>
+    </w:p>
+    <w:p>
+      <w:pPr>
+        <w:bidi/>
+        <w:spacing w:after="90"/>
+        <w:rPr>
+          <w:rFonts w:ascii="Sakkal Majalla" w:hAnsi="Sakkal Majalla" w:cs="Sakkal Majalla"/>
+          <w:sz w:val="26"/>
+          <w:szCs w:val="26"/>
+        </w:rPr>
+      </w:pPr>
+      <w:r>
+        <w:rPr>
+          <w:rFonts w:ascii="Sakkal Majalla" w:hAnsi="Sakkal Majalla" w:cs="Sakkal Majalla"/>
+          <w:color w:val="000000"/>
+          <w:sz w:val="26"/>
+          <w:szCs w:val="26"/>
+          <w:rtl/>
+        </w:rPr>
+        <w:t xml:space="preserve">هذه ثلاثة تمارين تأخذ مادتها من منتدى «أقومية القرآن» الذي أقامته مؤسسة وعي للدراسات والأبحاث في الدوحة (16 و17 أكتوبر 2026)، وتربطها بفصول الكتاب. والغاية منها أن يرى القارئ أدوات الكتاب تعمل على نصوص لم تُكتب له.</w:t>
+      </w:r>
+    </w:p>
+    <w:p>
+      <w:pPr>
+        <w:shd w:val="clear" w:color="auto" w:fill="156082"/>
+        <w:bidi/>
+        <w:spacing w:before="100" w:after="55"/>
+        <w:rPr>
+          <w:rFonts w:ascii="Sakkal Majalla" w:hAnsi="Sakkal Majalla" w:cs="Sakkal Majalla"/>
+          <w:sz w:val="26"/>
+          <w:szCs w:val="26"/>
+        </w:rPr>
+      </w:pPr>
+      <w:r>
+        <w:rPr>
+          <w:rFonts w:ascii="Sakkal Majalla" w:hAnsi="Sakkal Majalla" w:cs="Sakkal Majalla"/>
+          <w:b/>
+          <w:bCs/>
+          <w:color w:val="FFFFFF"/>
+          <w:sz w:val="26"/>
+          <w:szCs w:val="26"/>
+          <w:rtl/>
+        </w:rPr>
+        <w:t xml:space="preserve">التمرين الأول: البروتوكول الثماني على هود: 9–11 (الفصل السادس)</w:t>
+      </w:r>
+    </w:p>
+    <w:p>
+      <w:pPr>
+        <w:bidi/>
+        <w:spacing w:after="90"/>
+        <w:rPr>
+          <w:rFonts w:ascii="Sakkal Majalla" w:hAnsi="Sakkal Majalla" w:cs="Sakkal Majalla"/>
+          <w:sz w:val="26"/>
+          <w:szCs w:val="26"/>
+        </w:rPr>
+      </w:pPr>
+      <w:r>
+        <w:rPr>
+          <w:rFonts w:ascii="Sakkal Majalla" w:hAnsi="Sakkal Majalla" w:cs="Sakkal Majalla"/>
+          <w:color w:val="000000"/>
+          <w:sz w:val="26"/>
+          <w:szCs w:val="26"/>
+          <w:rtl/>
+        </w:rPr>
+        <w:t xml:space="preserve">اقرأ التطبيق الثاني في القسم 6.7 وجدوله، ثم أكمل ما بقي من التمرين: ارجع إلى القرطبي والرازي في الآيتين، وأحصِ مواضع جذرَي «ف خ ر» و«ي أ س» في المعجم المفهرس، ووثّق دلالة «الذوق» و«المسّ» من معجم معتمد، ثم اكتب إعلان المستوى في سطرين. وأخيرًا أجب عن سؤال صاحب التمرين نفسه: حين وصلت إلى ما كنت تتمناه، هل صرت أرحم بمن لا يزال يسعى، أم أصبحت جزءًا من المشقة التي يعانيها؟</w:t>
+      </w:r>
+    </w:p>
+    <w:p>
+      <w:pPr>
+        <w:shd w:val="clear" w:color="auto" w:fill="156082"/>
+        <w:bidi/>
+        <w:spacing w:before="100" w:after="55"/>
+        <w:rPr>
+          <w:rFonts w:ascii="Sakkal Majalla" w:hAnsi="Sakkal Majalla" w:cs="Sakkal Majalla"/>
+          <w:sz w:val="26"/>
+          <w:szCs w:val="26"/>
+        </w:rPr>
+      </w:pPr>
+      <w:r>
+        <w:rPr>
+          <w:rFonts w:ascii="Sakkal Majalla" w:hAnsi="Sakkal Majalla" w:cs="Sakkal Majalla"/>
+          <w:b/>
+          <w:bCs/>
+          <w:color w:val="FFFFFF"/>
+          <w:sz w:val="26"/>
+          <w:szCs w:val="26"/>
+          <w:rtl/>
+        </w:rPr>
+        <w:t xml:space="preserve">التمرين الثاني: بطاقة هوية معرفية لمفهوم من خارج الإدارة (الفصل الخامس)</w:t>
+      </w:r>
+    </w:p>
+    <w:p>
+      <w:pPr>
+        <w:bidi/>
+        <w:spacing w:after="90"/>
+        <w:rPr>
+          <w:rFonts w:ascii="Sakkal Majalla" w:hAnsi="Sakkal Majalla" w:cs="Sakkal Majalla"/>
+          <w:sz w:val="26"/>
+          <w:szCs w:val="26"/>
+        </w:rPr>
+      </w:pPr>
+      <w:r>
+        <w:rPr>
+          <w:rFonts w:ascii="Sakkal Majalla" w:hAnsi="Sakkal Majalla" w:cs="Sakkal Majalla"/>
+          <w:color w:val="000000"/>
+          <w:sz w:val="26"/>
+          <w:szCs w:val="26"/>
+          <w:rtl/>
+        </w:rPr>
+        <w:t xml:space="preserve">اختر مفهومًا شائعًا في بيئتك، كالهيبة أو النجاح أو الكرم، واكتب أولًا ما يقوله الناس فيه. ثم استقرئ شواهده في القرآن، وابدأ بالسياق قبل العدّ، وصنّف ما تجده في ثلاثة أعمدة: ما يثبته القرآن من الموروث، وما يصححه، وما غفل عنه الموروث. وأعلن الخلاف التفسيري حيث وُجد. ومثاله المحلول في الفصل الخامس: مفهوم الرجولة.</w:t>
+      </w:r>
+    </w:p>
+    <w:p>
+      <w:pPr>
+        <w:shd w:val="clear" w:color="auto" w:fill="156082"/>
+        <w:bidi/>
+        <w:spacing w:before="100" w:after="55"/>
+        <w:rPr>
+          <w:rFonts w:ascii="Sakkal Majalla" w:hAnsi="Sakkal Majalla" w:cs="Sakkal Majalla"/>
+          <w:sz w:val="26"/>
+          <w:szCs w:val="26"/>
+        </w:rPr>
+      </w:pPr>
+      <w:r>
+        <w:rPr>
+          <w:rFonts w:ascii="Sakkal Majalla" w:hAnsi="Sakkal Majalla" w:cs="Sakkal Majalla"/>
+          <w:b/>
+          <w:bCs/>
+          <w:color w:val="FFFFFF"/>
+          <w:sz w:val="26"/>
+          <w:szCs w:val="26"/>
+          <w:rtl/>
+        </w:rPr>
+        <w:t xml:space="preserve">أسئلة للنقاش: سورة الجاثية والتثبت (الفصل التاسع)</w:t>
+      </w:r>
+    </w:p>
+    <w:p>
+      <w:pPr>
+        <w:bidi/>
+        <w:spacing w:after="90"/>
+        <w:rPr>
+          <w:rFonts w:ascii="Sakkal Majalla" w:hAnsi="Sakkal Majalla" w:cs="Sakkal Majalla"/>
+          <w:sz w:val="26"/>
+          <w:szCs w:val="26"/>
+        </w:rPr>
+      </w:pPr>
+      <w:r>
+        <w:rPr>
+          <w:rFonts w:ascii="Sakkal Majalla" w:hAnsi="Sakkal Majalla" w:cs="Sakkal Majalla"/>
+          <w:color w:val="000000"/>
+          <w:sz w:val="26"/>
+          <w:szCs w:val="26"/>
+          <w:rtl/>
+        </w:rPr>
+        <w:t xml:space="preserve">كيف تتعامل مع الحق إذا جاء على لسان من لا تحب؟ اذكر قرارًا اخترت فيه النتيجة أولًا ثم جمعت ما يؤيدها، وما الذي كان سيتغير لو بدأت بالسؤال؟ ومتى تكلمت في اجتماع بثقة وليس عندك إلا الظن؟ وما الفرق بين الروتين الدفاعي عند أرجيرس واتباع الهوى في الجاثية: 18؟</w:t>
+      </w:r>
+    </w:p>
+    <w:p>
+      <w:pPr>
+        <w:shd w:val="clear" w:color="auto" w:fill="EBF5FB"/>
+        <w:bidi/>
+        <w:spacing w:after="60"/>
+        <w:ind w:right="220"/>
+        <w:rPr>
+          <w:rFonts w:ascii="Sakkal Majalla" w:hAnsi="Sakkal Majalla" w:cs="Sakkal Majalla"/>
+          <w:sz w:val="26"/>
+          <w:szCs w:val="26"/>
+        </w:rPr>
+      </w:pPr>
+      <w:r>
+        <w:rPr>
+          <w:rFonts w:ascii="Sakkal Majalla" w:hAnsi="Sakkal Majalla" w:cs="Sakkal Majalla"/>
+          <w:i/>
+          <w:iCs/>
+          <w:color w:val="000000"/>
+          <w:sz w:val="26"/>
+          <w:szCs w:val="26"/>
+          <w:rtl/>
+        </w:rPr>
+        <w:t xml:space="preserve">ملاحظة: النصوص المنقولة عن المنتدى منسوبة إلى أصحابها كما نُشرت، والنقول التفسيرية فيها بالمعنى، وتُطابق على الطبعات المعتمدة قبل الاستشهاد بها في بحث.</w:t>
       </w:r>
     </w:p>
     <w:sectPr>

</xml_diff>